<commit_message>
rebrand: use uppercase AI-FDE as project name
</commit_message>
<xml_diff>
--- a/examples/需求文档-小红书母婴代运营-2026-08-05.docx
+++ b/examples/需求文档-小红书母婴代运营-2026-08-05.docx
@@ -26,7 +26,7 @@
           <w:color w:val="595959"/>
           <w:sz w:val="21"/>
         </w:rPr>
-        <w:t>面向研发团队与项目经理 · 基于 ai-fde 一对一调研 · 缺口以 TBD 标注，不编造</w:t>
+        <w:t>面向研发团队与项目经理 · 基于 AI-FDE 一对一调研 · 缺口以 TBD 标注，不编造</w:t>
       </w:r>
     </w:p>
     <w:p>
@@ -232,7 +232,7 @@
                 <w:b w:val="0"/>
                 <w:sz w:val="21"/>
               </w:rPr>
-              <w:t>ai-fde（基于一对一调研）</w:t>
+              <w:t>AI-FDE（基于一对一调研）</w:t>
             </w:r>
           </w:p>
         </w:tc>

</xml_diff>